<commit_message>
docs: revise SRS v1.3 (per-team/role, roadmap, prototype auth) + add implementation plan
- SRS v1.3: Purpose stripped of implementation detail; User Characteristics as a
  table; Approaches rewritten with alternatives + rationale; NFRs as pure
  requirements; audience widened to global/team/role/user; hosted-Anthropic LLM
  adapter + FTS-now/vectors-later; prototype auth + module simulators; delivery
  recast as five weekly milestones (FR-1..29 retagged by week)
- open-questions-and-decisions.md: synced to the above (per-team/role decided,
  LLM adapter, prototype scaffolding, weekly roadmap)
- gantt: 5 weekly milestones (regenerated gantt.html from gantt-tasks.json)
- architecture.md: audiences, LLM adapter/retriever interface, prototype auth +
  simulators, users/roles/teams data model, weekly roadmap
- add docs/implementation-plan.md: full week-by-week build plan for a future session
</commit_message>
<xml_diff>
--- a/docs/srs/SRS - Centralized Notification System - v1.3.docx
+++ b/docs/srs/SRS - Centralized Notification System - v1.3.docx
@@ -90,7 +90,7 @@
     <w:p>
       <w:pPr/>
       <w:r>
-        <w:t>This document specifies the requirements for the Centralized Notification System — a shared, domain-agnostic service that ingests notifications from any module of an enterprise application, applies centrally-administered and per-user policy, and presents them to each user in a single, unified, AI-assisted feed. The system is built around two principles: a generic backend, in which every notification is handled through one stable, module-agnostic contract; and a dynamic, JSON-driven frontend, in which as much of the interface as is practical is rendered from configuration rather than hand-coded. Its delivery is phased — the first milestone centers on the user-facing feed and its AI features over a basic backend, and centralized administration together with the event-stream intake path follow in a second milestone.</w:t>
+        <w:t>This document specifies the requirements for the Centralized Notification System — a single place where the people who use an enterprise application can receive, organize, and act on the notifications produced across all of its modules. Instead of checking each module separately, a user sees one unified, prioritized feed, gets AI help to summarize what is waiting and answer questions about it, and administrators can govern how notifications behave for everyone. The goal is to turn scattered, noisy, per-module alerts into one coherent, controllable, and digestible experience.</w:t>
       </w:r>
     </w:p>
     <w:p>
@@ -104,7 +104,7 @@
     <w:p>
       <w:pPr/>
       <w:r>
-        <w:t>An enterprise application is made up of many modules, each of which generates and surfaces its own notifications through its own ad-hoc mechanism. Today a user has no centralized place to see all of their notifications — they must visit each module individually to find what is relevant — and the alerts that do reach them arrive fragmented, noisy, and un-prioritized, with no unified control. Operators face the mirror-image problem: there is no single place to govern notification behavior — to silence a module that is malfunctioning, to tune the AI features against the resources they consume, or to broadcast a message to everyone. The Centralized Notification System addresses both by providing one generic ingestion-and-presentation layer for notifications, together with a central administration surface.</w:t>
+        <w:t>An enterprise application is made up of many modules, each of which generates and surfaces its own notifications in its own way. Today a user has no centralized place to see all of their notifications — they must visit each module individually to find what is relevant — and the alerts that do reach them arrive fragmented, noisy, and un-prioritized, with no unified control. Operators face the mirror-image problem: there is no single place to govern notification behavior — to silence a module that is misbehaving, to tune the AI features against the resources they consume, or to send a message to everyone at once.</w:t>
       </w:r>
     </w:p>
     <w:p>
@@ -129,29 +129,40 @@
         </w:numPr>
       </w:pPr>
       <w:r>
-        <w:t>Generic ingestion of notifications from any module through a single, stable contract, and their real-time delivery to a unified feed.</w:t>
-      </w:r>
-    </w:p>
-    <w:p>
-      <w:pPr>
-        <w:numPr>
-          <w:ilvl w:val="0"/>
-          <w:numId w:val="1"/>
-        </w:numPr>
-      </w:pPr>
-      <w:r>
-        <w:t>A feed that categorizes, groups similar notifications, prioritizes, filters, snoozes, and supports inline actions.</w:t>
-      </w:r>
-    </w:p>
-    <w:p>
-      <w:pPr>
-        <w:numPr>
-          <w:ilvl w:val="0"/>
-          <w:numId w:val="1"/>
-        </w:numPr>
-      </w:pPr>
-      <w:r>
-        <w:t>AI assistance: summarization of unread notifications (on demand and on a schedule) and a question-and-answer chatbot over a user's own notification history.</w:t>
+        <w:t>Aggregating notifications from all of an application's modules into one unified feed.</w:t>
+      </w:r>
+    </w:p>
+    <w:p>
+      <w:pPr>
+        <w:numPr>
+          <w:ilvl w:val="0"/>
+          <w:numId w:val="1"/>
+        </w:numPr>
+      </w:pPr>
+      <w:r>
+        <w:t>Presenting a categorized, prioritized feed with grouping of similar notifications, filtering, snoozing, and inline actions.</w:t>
+      </w:r>
+    </w:p>
+    <w:p>
+      <w:pPr>
+        <w:numPr>
+          <w:ilvl w:val="0"/>
+          <w:numId w:val="1"/>
+        </w:numPr>
+      </w:pPr>
+      <w:r>
+        <w:t>Targeting notifications to the whole company (global), a team, a role, or an individual.</w:t>
+      </w:r>
+    </w:p>
+    <w:p>
+      <w:pPr>
+        <w:numPr>
+          <w:ilvl w:val="0"/>
+          <w:numId w:val="1"/>
+        </w:numPr>
+      </w:pPr>
+      <w:r>
+        <w:t>AI assistance: summarizing unread notifications (on demand and on a schedule) and answering questions about a user's notification history.</w:t>
       </w:r>
     </w:p>
     <w:p>
@@ -184,7 +195,7 @@
         </w:numPr>
       </w:pPr>
       <w:r>
-        <w:t>An audience/scope concept that prepares the system for future per-team targeting.</w:t>
+        <w:t>For prototyping, a simple built-in authentication system and simulated modules, since the system is not yet embedded in the host application.</w:t>
       </w:r>
     </w:p>
     <w:p>
@@ -201,9 +212,248 @@
     <w:p>
       <w:pPr/>
       <w:r>
-        <w:t>Delivery is phased. The first milestone focuses on the frontend feed and its AI features over a basic backend that can deliver notifications — categorization, grouping, prioritization, filtering, snoozing, actions, AI summarization, the AI chatbot, and per-user preferences — with features built one at a time. The second milestone adds the Admin panel and its governance, full authorization, and the event-stream (Redis Streams) intake path.</w:t>
-      </w:r>
-    </w:p>
+        <w:t>Delivery is planned as a series of weekly milestones, each of which leaves a working, demonstrable system:</w:t>
+      </w:r>
+    </w:p>
+    <w:tbl>
+      <w:tblPr>
+        <w:tblW w:type="auto" w:w="0"/>
+        <w:tblLayout w:type="autofit"/>
+        <w:tblLook w:firstColumn="1" w:firstRow="1" w:lastColumn="0" w:lastRow="0" w:noHBand="0" w:noVBand="1" w:val="04A0"/>
+        <w:tblBorders>
+          <w:top w:val="single" w:sz="4" w:space="0" w:color="auto"/>
+          <w:left w:val="single" w:sz="4" w:space="0" w:color="auto"/>
+          <w:bottom w:val="single" w:sz="4" w:space="0" w:color="auto"/>
+          <w:right w:val="single" w:sz="4" w:space="0" w:color="auto"/>
+          <w:insideH w:val="single" w:sz="4" w:space="0" w:color="auto"/>
+          <w:insideV w:val="single" w:sz="4" w:space="0" w:color="auto"/>
+        </w:tblBorders>
+      </w:tblPr>
+      <w:tblGrid>
+        <w:gridCol w:w="3120"/>
+        <w:gridCol w:w="3120"/>
+        <w:gridCol w:w="3120"/>
+      </w:tblGrid>
+      <w:tr>
+        <w:tc>
+          <w:tcPr>
+            <w:tcW w:type="dxa" w:w="3120"/>
+          </w:tcPr>
+          <w:p>
+            <w:r/>
+            <w:r>
+              <w:rPr>
+                <w:b/>
+              </w:rPr>
+              <w:t>Week</w:t>
+            </w:r>
+          </w:p>
+        </w:tc>
+        <w:tc>
+          <w:tcPr>
+            <w:tcW w:type="dxa" w:w="3120"/>
+          </w:tcPr>
+          <w:p>
+            <w:r/>
+            <w:r>
+              <w:rPr>
+                <w:b/>
+              </w:rPr>
+              <w:t>Milestone</w:t>
+            </w:r>
+          </w:p>
+        </w:tc>
+        <w:tc>
+          <w:tcPr>
+            <w:tcW w:type="dxa" w:w="3120"/>
+          </w:tcPr>
+          <w:p>
+            <w:r/>
+            <w:r>
+              <w:rPr>
+                <w:b/>
+              </w:rPr>
+              <w:t>Functional outcome delivered</w:t>
+            </w:r>
+          </w:p>
+        </w:tc>
+      </w:tr>
+      <w:tr>
+        <w:tc>
+          <w:tcPr>
+            <w:tcW w:type="dxa" w:w="3120"/>
+          </w:tcPr>
+          <w:p>
+            <w:r/>
+            <w:r>
+              <w:t>1</w:t>
+            </w:r>
+          </w:p>
+        </w:tc>
+        <w:tc>
+          <w:tcPr>
+            <w:tcW w:type="dxa" w:w="3120"/>
+          </w:tcPr>
+          <w:p>
+            <w:r/>
+            <w:r>
+              <w:t>Skeleton + live feed</w:t>
+            </w:r>
+          </w:p>
+        </w:tc>
+        <w:tc>
+          <w:tcPr>
+            <w:tcW w:type="dxa" w:w="3120"/>
+          </w:tcPr>
+          <w:p>
+            <w:r/>
+            <w:r>
+              <w:t>Prototype login; a module simulator; notifications flow end-to-end into a live, unified feed that loads incrementally.</w:t>
+            </w:r>
+          </w:p>
+        </w:tc>
+      </w:tr>
+      <w:tr>
+        <w:tc>
+          <w:tcPr>
+            <w:tcW w:type="dxa" w:w="3120"/>
+          </w:tcPr>
+          <w:p>
+            <w:r/>
+            <w:r>
+              <w:t>2</w:t>
+            </w:r>
+          </w:p>
+        </w:tc>
+        <w:tc>
+          <w:tcPr>
+            <w:tcW w:type="dxa" w:w="3120"/>
+          </w:tcPr>
+          <w:p>
+            <w:r/>
+            <w:r>
+              <w:t>Basic admin + organized feed</w:t>
+            </w:r>
+          </w:p>
+        </w:tc>
+        <w:tc>
+          <w:tcPr>
+            <w:tcW w:type="dxa" w:w="3120"/>
+          </w:tcPr>
+          <w:p>
+            <w:r/>
+            <w:r>
+              <w:t>Publishing modules are auto-discovered; a basic Admin panel enables/disables modules and toggles major features for everyone; the feed is categorized, prioritized, and filterable.</w:t>
+            </w:r>
+          </w:p>
+        </w:tc>
+      </w:tr>
+      <w:tr>
+        <w:tc>
+          <w:tcPr>
+            <w:tcW w:type="dxa" w:w="3120"/>
+          </w:tcPr>
+          <w:p>
+            <w:r/>
+            <w:r>
+              <w:t>3</w:t>
+            </w:r>
+          </w:p>
+        </w:tc>
+        <w:tc>
+          <w:tcPr>
+            <w:tcW w:type="dxa" w:w="3120"/>
+          </w:tcPr>
+          <w:p>
+            <w:r/>
+            <w:r>
+              <w:t>AI features</w:t>
+            </w:r>
+          </w:p>
+        </w:tc>
+        <w:tc>
+          <w:tcPr>
+            <w:tcW w:type="dxa" w:w="3120"/>
+          </w:tcPr>
+          <w:p>
+            <w:r/>
+            <w:r>
+              <w:t>On-demand and scheduled summaries of unread notifications, and a chatbot that answers questions about a user's notifications; administrators can configure the AI.</w:t>
+            </w:r>
+          </w:p>
+        </w:tc>
+      </w:tr>
+      <w:tr>
+        <w:tc>
+          <w:tcPr>
+            <w:tcW w:type="dxa" w:w="3120"/>
+          </w:tcPr>
+          <w:p>
+            <w:r/>
+            <w:r>
+              <w:t>4</w:t>
+            </w:r>
+          </w:p>
+        </w:tc>
+        <w:tc>
+          <w:tcPr>
+            <w:tcW w:type="dxa" w:w="3120"/>
+          </w:tcPr>
+          <w:p>
+            <w:r/>
+            <w:r>
+              <w:t>Audiences, preferences &amp; interaction</w:t>
+            </w:r>
+          </w:p>
+        </w:tc>
+        <w:tc>
+          <w:tcPr>
+            <w:tcW w:type="dxa" w:w="3120"/>
+          </w:tcPr>
+          <w:p>
+            <w:r/>
+            <w:r>
+              <w:t>Notifications target global / team / role / individual; users set their own preferences beneath the global policy; similar notifications are grouped, and users can snooze, act, and navigate.</w:t>
+            </w:r>
+          </w:p>
+        </w:tc>
+      </w:tr>
+      <w:tr>
+        <w:tc>
+          <w:tcPr>
+            <w:tcW w:type="dxa" w:w="3120"/>
+          </w:tcPr>
+          <w:p>
+            <w:r/>
+            <w:r>
+              <w:t>5</w:t>
+            </w:r>
+          </w:p>
+        </w:tc>
+        <w:tc>
+          <w:tcPr>
+            <w:tcW w:type="dxa" w:w="3120"/>
+          </w:tcPr>
+          <w:p>
+            <w:r/>
+            <w:r>
+              <w:t>Hardening + admin expansion</w:t>
+            </w:r>
+          </w:p>
+        </w:tc>
+        <w:tc>
+          <w:tcPr>
+            <w:tcW w:type="dxa" w:w="3120"/>
+          </w:tcPr>
+          <w:p>
+            <w:r/>
+            <w:r>
+              <w:t>Audit log, resource/health observability, broadcasts, configuration export/import, global controls, notification lifecycle; durable event-stream intake with dead-letter handling; performance pass and tests; the seam for production host-application auth. Stretch: semantic (vector) retrieval.</w:t>
+            </w:r>
+          </w:p>
+        </w:tc>
+      </w:tr>
+    </w:tbl>
     <w:p>
       <w:pPr/>
       <w:r>
@@ -218,17 +468,6 @@
         </w:numPr>
       </w:pPr>
       <w:r>
-        <w:t>Per-team notifications: the model is prepared for them and reserves an audience/scope concept, but they are not built in this version, and specific team identifiers are a future need.</w:t>
-      </w:r>
-    </w:p>
-    <w:p>
-      <w:pPr>
-        <w:numPr>
-          <w:ilvl w:val="0"/>
-          <w:numId w:val="1"/>
-        </w:numPr>
-      </w:pPr>
-      <w:r>
         <w:t>Delivery to external channels such as email, SMS, push, or chat platforms — the system is in-app only.</w:t>
       </w:r>
     </w:p>
@@ -251,7 +490,18 @@
         </w:numPr>
       </w:pPr>
       <w:r>
-        <w:t>Quantitative performance, scalability, and availability service-level targets — the engineering approach is specified, but concrete numbers await measurement.</w:t>
+        <w:t>Integration with the host application's real identity provider and real modules — the prototype uses its own simple authentication and simulated modules; production integration is a later step.</w:t>
+      </w:r>
+    </w:p>
+    <w:p>
+      <w:pPr>
+        <w:numPr>
+          <w:ilvl w:val="0"/>
+          <w:numId w:val="1"/>
+        </w:numPr>
+      </w:pPr>
+      <w:r>
+        <w:t>Quantitative performance, scalability, and availability service-level targets — set once measurable.</w:t>
       </w:r>
     </w:p>
     <w:p>
@@ -273,7 +523,7 @@
     <w:p>
       <w:pPr/>
       <w:r>
-        <w:t>The Centralized Notification System is a shared, standalone, domain-agnostic layer that sits alongside the other modules of an enterprise application. It is the system of record for the notifications it holds and relies on the host application for user identity and session. Because it is generic, it holds no knowledge of any individual module's business meaning; the same service could serve any enterprise application.</w:t>
+        <w:t>The Centralized Notification System is a shared layer that serves the users of an enterprise application. In production it sits alongside the application's other modules, drawing user identity from the host application and receiving notifications from real modules. For now it runs standalone for prototyping: it provides its own simple authentication and is fed by simulated modules, so it can be built and demonstrated before being embedded in the host application. It is the system of record for the notifications it holds and holds no knowledge of any individual module's business meaning.</w:t>
       </w:r>
     </w:p>
     <w:p>
@@ -298,7 +548,7 @@
         </w:numPr>
       </w:pPr>
       <w:r>
-        <w:t>Accept notifications from any module and present them to the right users.</w:t>
+        <w:t>Accept notifications from any of the application's modules and present them to the users they are meant for — the whole company, a team, a role, or an individual.</w:t>
       </w:r>
     </w:p>
     <w:p>
@@ -320,29 +570,18 @@
         </w:numPr>
       </w:pPr>
       <w:r>
-        <w:t>Summarize a user's unread notifications on demand and on a schedule.</w:t>
-      </w:r>
-    </w:p>
-    <w:p>
-      <w:pPr>
-        <w:numPr>
-          <w:ilvl w:val="0"/>
-          <w:numId w:val="1"/>
-        </w:numPr>
-      </w:pPr>
-      <w:r>
-        <w:t>Answer a user's questions about their own notification history.</w:t>
-      </w:r>
-    </w:p>
-    <w:p>
-      <w:pPr>
-        <w:numPr>
-          <w:ilvl w:val="0"/>
-          <w:numId w:val="1"/>
-        </w:numPr>
-      </w:pPr>
-      <w:r>
-        <w:t>Let each user manage their own notification preferences.</w:t>
+        <w:t>Summarize a user's unread notifications on demand and on a schedule, and answer questions about their history.</w:t>
+      </w:r>
+    </w:p>
+    <w:p>
+      <w:pPr>
+        <w:numPr>
+          <w:ilvl w:val="0"/>
+          <w:numId w:val="1"/>
+        </w:numPr>
+      </w:pPr>
+      <w:r>
+        <w:t>Let each user set their own notification preferences.</w:t>
       </w:r>
     </w:p>
     <w:p>
@@ -381,37 +620,179 @@
         <w:t>The system is used by the following classes of users:</w:t>
       </w:r>
     </w:p>
-    <w:p>
-      <w:pPr>
-        <w:numPr>
-          <w:ilvl w:val="0"/>
-          <w:numId w:val="1"/>
-        </w:numPr>
-      </w:pPr>
-      <w:r>
-        <w:t>End users receive, read, act on, snooze, and query their notifications, and set their own preferences.</w:t>
-      </w:r>
-    </w:p>
-    <w:p>
-      <w:pPr>
-        <w:numPr>
-          <w:ilvl w:val="0"/>
-          <w:numId w:val="1"/>
-        </w:numPr>
-      </w:pPr>
-      <w:r>
-        <w:t>Administrator — a privileged role that governs system-wide notification behavior through the Admin panel (second milestone). Administrative surfaces require authentication and the administrator role.</w:t>
-      </w:r>
-    </w:p>
-    <w:p>
-      <w:pPr>
-        <w:numPr>
-          <w:ilvl w:val="0"/>
-          <w:numId w:val="1"/>
-        </w:numPr>
-      </w:pPr>
-      <w:r>
-        <w:t>Publishing modules — any service that emits a well-formed notification; no pre-registration is required, and modules are discovered automatically as they publish.</w:t>
+    <w:tbl>
+      <w:tblPr>
+        <w:tblW w:type="auto" w:w="0"/>
+        <w:tblLayout w:type="autofit"/>
+        <w:tblLook w:firstColumn="1" w:firstRow="1" w:lastColumn="0" w:lastRow="0" w:noHBand="0" w:noVBand="1" w:val="04A0"/>
+        <w:tblBorders>
+          <w:top w:val="single" w:sz="4" w:space="0" w:color="auto"/>
+          <w:left w:val="single" w:sz="4" w:space="0" w:color="auto"/>
+          <w:bottom w:val="single" w:sz="4" w:space="0" w:color="auto"/>
+          <w:right w:val="single" w:sz="4" w:space="0" w:color="auto"/>
+          <w:insideH w:val="single" w:sz="4" w:space="0" w:color="auto"/>
+          <w:insideV w:val="single" w:sz="4" w:space="0" w:color="auto"/>
+        </w:tblBorders>
+      </w:tblPr>
+      <w:tblGrid>
+        <w:gridCol w:w="3120"/>
+        <w:gridCol w:w="3120"/>
+        <w:gridCol w:w="3120"/>
+      </w:tblGrid>
+      <w:tr>
+        <w:tc>
+          <w:tcPr>
+            <w:tcW w:type="dxa" w:w="3120"/>
+          </w:tcPr>
+          <w:p>
+            <w:r/>
+            <w:r>
+              <w:rPr>
+                <w:b/>
+              </w:rPr>
+              <w:t>User class</w:t>
+            </w:r>
+          </w:p>
+        </w:tc>
+        <w:tc>
+          <w:tcPr>
+            <w:tcW w:type="dxa" w:w="3120"/>
+          </w:tcPr>
+          <w:p>
+            <w:r/>
+            <w:r>
+              <w:rPr>
+                <w:b/>
+              </w:rPr>
+              <w:t>Description</w:t>
+            </w:r>
+          </w:p>
+        </w:tc>
+        <w:tc>
+          <w:tcPr>
+            <w:tcW w:type="dxa" w:w="3120"/>
+          </w:tcPr>
+          <w:p>
+            <w:r/>
+            <w:r>
+              <w:rPr>
+                <w:b/>
+              </w:rPr>
+              <w:t>Key capabilities</w:t>
+            </w:r>
+          </w:p>
+        </w:tc>
+      </w:tr>
+      <w:tr>
+        <w:tc>
+          <w:tcPr>
+            <w:tcW w:type="dxa" w:w="3120"/>
+          </w:tcPr>
+          <w:p>
+            <w:r/>
+            <w:r>
+              <w:t>End user</w:t>
+            </w:r>
+          </w:p>
+        </w:tc>
+        <w:tc>
+          <w:tcPr>
+            <w:tcW w:type="dxa" w:w="3120"/>
+          </w:tcPr>
+          <w:p>
+            <w:r/>
+            <w:r>
+              <w:t>A person who uses the enterprise application; has one or more roles and belongs to one or more teams.</w:t>
+            </w:r>
+          </w:p>
+        </w:tc>
+        <w:tc>
+          <w:tcPr>
+            <w:tcW w:type="dxa" w:w="3120"/>
+          </w:tcPr>
+          <w:p>
+            <w:r/>
+            <w:r>
+              <w:t>Reads, filters, prioritizes, groups, snoozes, acts on, and navigates from their notifications; asks the AI about them; sets their own preferences.</w:t>
+            </w:r>
+          </w:p>
+        </w:tc>
+      </w:tr>
+      <w:tr>
+        <w:tc>
+          <w:tcPr>
+            <w:tcW w:type="dxa" w:w="3120"/>
+          </w:tcPr>
+          <w:p>
+            <w:r/>
+            <w:r>
+              <w:t>Administrator</w:t>
+            </w:r>
+          </w:p>
+        </w:tc>
+        <w:tc>
+          <w:tcPr>
+            <w:tcW w:type="dxa" w:w="3120"/>
+          </w:tcPr>
+          <w:p>
+            <w:r/>
+            <w:r>
+              <w:t>A privileged role that governs notification behavior for everyone.</w:t>
+            </w:r>
+          </w:p>
+        </w:tc>
+        <w:tc>
+          <w:tcPr>
+            <w:tcW w:type="dxa" w:w="3120"/>
+          </w:tcPr>
+          <w:p>
+            <w:r/>
+            <w:r>
+              <w:t>Enables/disables modules and features, tunes the AI, broadcasts announcements, and monitors system health and resource usage.</w:t>
+            </w:r>
+          </w:p>
+        </w:tc>
+      </w:tr>
+      <w:tr>
+        <w:tc>
+          <w:tcPr>
+            <w:tcW w:type="dxa" w:w="3120"/>
+          </w:tcPr>
+          <w:p>
+            <w:r/>
+            <w:r>
+              <w:t>Publishing module</w:t>
+            </w:r>
+          </w:p>
+        </w:tc>
+        <w:tc>
+          <w:tcPr>
+            <w:tcW w:type="dxa" w:w="3120"/>
+          </w:tcPr>
+          <w:p>
+            <w:r/>
+            <w:r>
+              <w:t>Any part of the application that emits notifications (simulated in the prototype).</w:t>
+            </w:r>
+          </w:p>
+        </w:tc>
+        <w:tc>
+          <w:tcPr>
+            <w:tcW w:type="dxa" w:w="3120"/>
+          </w:tcPr>
+          <w:p>
+            <w:r/>
+            <w:r>
+              <w:t>Sends notifications through the common interface; discovered automatically on first publish.</w:t>
+            </w:r>
+          </w:p>
+        </w:tc>
+      </w:tr>
+    </w:tbl>
+    <w:p>
+      <w:pPr/>
+      <w:r>
+        <w:t>Teams and roles are attributes of users, and a notification's audience targets the company, a team, a role, or an individual accordingly. In the prototype, users, roles, and team membership are seeded through the built-in authentication system.</w:t>
       </w:r>
     </w:p>
     <w:p>
@@ -430,7 +811,7 @@
         </w:numPr>
       </w:pPr>
       <w:r>
-        <w:t>Frontend: Vue 3 (Composition API, &lt;script setup&gt;) with TypeScript, Vite, Pinia, and Vue Router. As much of the interface as practical — forms, notification cards, filters, administrative controls, and preferences — is rendered from JSON schemas and configuration by shared renderers (extending the shared FormRenderer). Long lists are virtualized with a lightweight windowing library, keeping the project's existing design system.</w:t>
+        <w:t>Frontend: Vue 3 (Composition API, &lt;script setup&gt;) with TypeScript, Vite, Pinia, and Vue Router. The interface is dynamic and JSON-driven — forms, notification cards, filters, admin controls, and preferences are rendered from schemas and configuration by shared renderers extending the shared FormRenderer. Long lists are virtualized with a lightweight windowing library, keeping the project's existing design system.</w:t>
       </w:r>
     </w:p>
     <w:p>
@@ -452,18 +833,7 @@
         </w:numPr>
       </w:pPr>
       <w:r>
-        <w:t>Database: the latest stable PostgreSQL release, used as the system of record for notifications, delivery/read status, administrative configuration, per-user preferences, and the audit log — with indexing, keyset pagination, and time-partitioning for scale.</w:t>
-      </w:r>
-    </w:p>
-    <w:p>
-      <w:pPr>
-        <w:numPr>
-          <w:ilvl w:val="0"/>
-          <w:numId w:val="1"/>
-        </w:numPr>
-      </w:pPr>
-      <w:r>
-        <w:t>Broker: Redis Streams as the notification intake broker, introduced in the second milestone; the first milestone uses a simpler intake.</w:t>
+        <w:t>Data: the latest stable PostgreSQL release as the system of record (notifications, delivery/read status, administrative configuration, per-user preferences, users/roles/teams, and the audit log), with indexing, keyset pagination, and time-partitioning for scale.</w:t>
       </w:r>
     </w:p>
     <w:p>
@@ -485,18 +855,40 @@
         </w:numPr>
       </w:pPr>
       <w:r>
-        <w:t>AI / LLM: a locally-hosted model served by Ollama (default Llama 3.2 3B Instruct), used for generation only, with retrieval provided by PostgreSQL Full-Text Search.</w:t>
-      </w:r>
-    </w:p>
-    <w:p>
-      <w:pPr>
-        <w:numPr>
-          <w:ilvl w:val="0"/>
-          <w:numId w:val="1"/>
-        </w:numPr>
-      </w:pPr>
-      <w:r>
-        <w:t>Shared TypeScript types and validation schemas live in packages/shared.</w:t>
+        <w:t>AI: a pluggable LLM adapter with a hosted model by default — Anthropic (Claude) models, the ones available to the team — with a local model via Ollama kept as a swappable option. Retrieval sits behind a small retriever interface, using PostgreSQL Full-Text Search now, with vector embeddings (pgvector) as a later upgrade.</w:t>
+      </w:r>
+    </w:p>
+    <w:p>
+      <w:pPr>
+        <w:numPr>
+          <w:ilvl w:val="0"/>
+          <w:numId w:val="1"/>
+        </w:numPr>
+      </w:pPr>
+      <w:r>
+        <w:t>Prototyping: a simple built-in authentication system (username/password with a session; roles; team membership; seedable) and one or more module simulators that emit notifications — both replaced by host-application authentication and real modules in production.</w:t>
+      </w:r>
+    </w:p>
+    <w:p>
+      <w:pPr>
+        <w:numPr>
+          <w:ilvl w:val="0"/>
+          <w:numId w:val="1"/>
+        </w:numPr>
+      </w:pPr>
+      <w:r>
+        <w:t>Event stream: Redis Streams as the intake broker, introduced in a later milestone; earlier milestones use a simpler direct intake.</w:t>
+      </w:r>
+    </w:p>
+    <w:p>
+      <w:pPr>
+        <w:numPr>
+          <w:ilvl w:val="0"/>
+          <w:numId w:val="1"/>
+        </w:numPr>
+      </w:pPr>
+      <w:r>
+        <w:t>Shared TypeScript types and zod validation schemas live in packages/shared.</w:t>
       </w:r>
     </w:p>
     <w:p>
@@ -510,106 +902,117 @@
     <w:p>
       <w:pPr/>
       <w:r>
-        <w:t>The main architectural decisions and their rationale:</w:t>
-      </w:r>
-    </w:p>
-    <w:p>
-      <w:pPr>
-        <w:numPr>
-          <w:ilvl w:val="0"/>
-          <w:numId w:val="1"/>
-        </w:numPr>
-      </w:pPr>
-      <w:r>
-        <w:t>Global, administrator-governed base with a per-user layer. A central administrative configuration is the base policy applied to all users, and per-user preferences layer on top. Suppressions stack: a global disable or snooze always wins, and a per-user setting may only further restrict.</w:t>
-      </w:r>
-    </w:p>
-    <w:p>
-      <w:pPr>
-        <w:numPr>
-          <w:ilvl w:val="0"/>
-          <w:numId w:val="1"/>
-        </w:numPr>
-      </w:pPr>
-      <w:r>
-        <w:t>Generic, domain-agnostic backend. Every notification flows through one fixed contract with an opaque metadata field that the system stores and passes through but never interprets; transport and delivery are abstracted, policy is data-driven with no per-module code, and input is strictly validated. A new source module or delivery channel needs no changes to the core.</w:t>
-      </w:r>
-    </w:p>
-    <w:p>
-      <w:pPr>
-        <w:numPr>
-          <w:ilvl w:val="0"/>
-          <w:numId w:val="1"/>
-        </w:numPr>
-      </w:pPr>
-      <w:r>
-        <w:t>Dynamic, JSON-driven frontend. As much of the interface as practical is rendered from configuration by shared renderers — the frontend mirror of the generic backend — so a notification of a new kind renders without frontend code, and everything inherits the design system by construction.</w:t>
-      </w:r>
-    </w:p>
-    <w:p>
-      <w:pPr>
-        <w:numPr>
-          <w:ilvl w:val="0"/>
-          <w:numId w:val="1"/>
-        </w:numPr>
-      </w:pPr>
-      <w:r>
-        <w:t>Audience/scope concept. Each notification carries an audience — global for now, with team and user reserved. Per-team targeting is not built yet and will require specific team identifiers.</w:t>
-      </w:r>
-    </w:p>
-    <w:p>
-      <w:pPr>
-        <w:numPr>
-          <w:ilvl w:val="0"/>
-          <w:numId w:val="1"/>
-        </w:numPr>
-      </w:pPr>
-      <w:r>
-        <w:t>Auto-discovered modules rather than a pre-registered allowlist, so the backend stays generic.</w:t>
-      </w:r>
-    </w:p>
-    <w:p>
-      <w:pPr>
-        <w:numPr>
-          <w:ilvl w:val="0"/>
-          <w:numId w:val="1"/>
-        </w:numPr>
-      </w:pPr>
-      <w:r>
-        <w:t>Phased delivery: the frontend and AI features first over a basic backend, and administration together with the event-stream intake second, built one feature at a time.</w:t>
-      </w:r>
-    </w:p>
-    <w:p>
-      <w:pPr>
-        <w:numPr>
-          <w:ilvl w:val="0"/>
-          <w:numId w:val="1"/>
-        </w:numPr>
-      </w:pPr>
-      <w:r>
-        <w:t>Administrative configuration stored in the database and editable through the Admin panel, and exportable and importable as a single configuration artifact.</w:t>
-      </w:r>
-    </w:p>
-    <w:p>
-      <w:pPr>
-        <w:numPr>
-          <w:ilvl w:val="0"/>
-          <w:numId w:val="1"/>
-        </w:numPr>
-      </w:pPr>
-      <w:r>
-        <w:t>Performance treated as a first-class concern across both tiers (see NFR-2).</w:t>
-      </w:r>
-    </w:p>
-    <w:p>
-      <w:pPr>
-        <w:numPr>
-          <w:ilvl w:val="0"/>
-          <w:numId w:val="1"/>
-        </w:numPr>
-      </w:pPr>
-      <w:r>
-        <w:t>Retained decisions: in-app delivery only; a single, non-multi-tenant deployment; Server-Sent Events for real-time delivery; de-duplication on the notification id; Fastify on the backend; a locally-hosted Ollama model with PostgreSQL Full-Text Search retrieval; and per-recipient, per-module, per-category rate limiting.</w:t>
+        <w:t>The main design decisions, the alternatives considered, and why the current choice was made:</w:t>
+      </w:r>
+    </w:p>
+    <w:p>
+      <w:pPr>
+        <w:numPr>
+          <w:ilvl w:val="0"/>
+          <w:numId w:val="1"/>
+        </w:numPr>
+      </w:pPr>
+      <w:r>
+        <w:t>Notification intake. Options: a message broker (Redis Streams), modules calling a REST API directly, or a shared database queue. Chosen: an abstracted intake boundary — a simple direct/HTTP intake for the early prototype, with Redis Streams (durable, consumer groups, acknowledgements) added later behind the same boundary. Rationale: this unblocks end-to-end demos immediately without committing to broker infrastructure up front, while keeping a clean seam so the durable path drops in without a rewrite.</w:t>
+      </w:r>
+    </w:p>
+    <w:p>
+      <w:pPr>
+        <w:numPr>
+          <w:ilvl w:val="0"/>
+          <w:numId w:val="1"/>
+        </w:numPr>
+      </w:pPr>
+      <w:r>
+        <w:t>Real-time delivery. Options: Server-Sent Events, WebSockets, or periodic polling. Chosen: SSE. Rationale: delivery is one-way server-to-client push, so SSE is simpler than WebSockets (no bidirectional channel to manage) and far more timely and efficient than polling.</w:t>
+      </w:r>
+    </w:p>
+    <w:p>
+      <w:pPr>
+        <w:numPr>
+          <w:ilvl w:val="0"/>
+          <w:numId w:val="1"/>
+        </w:numPr>
+      </w:pPr>
+      <w:r>
+        <w:t>Policy model. Options: a single global policy, per-user settings only, or a layered model. Chosen: a global administrator policy with a per-user preference layer, where suppressions stack — a global disable always wins and a user may only further restrict. Rationale: administrators need one lever over everyone (e.g., silence a malfunctioning module) while users still tailor their own feed, and a user must not be able to re-enable something switched off for operational reasons.</w:t>
+      </w:r>
+    </w:p>
+    <w:p>
+      <w:pPr>
+        <w:numPr>
+          <w:ilvl w:val="0"/>
+          <w:numId w:val="1"/>
+        </w:numPr>
+      </w:pPr>
+      <w:r>
+        <w:t>Backend genericness. Options: per-module handling code, or one generic contract with an opaque metadata field. Chosen: generic — every notification flows through one fixed contract and the system never interprets module-specific data. Rationale: a new module needs no backend changes; the trade-off is that module-specific richness lives in metadata rather than as first-class fields.</w:t>
+      </w:r>
+    </w:p>
+    <w:p>
+      <w:pPr>
+        <w:numPr>
+          <w:ilvl w:val="0"/>
+          <w:numId w:val="1"/>
+        </w:numPr>
+      </w:pPr>
+      <w:r>
+        <w:t>Frontend construction. Options: hand-coded screens and cards, or configuration-driven rendering. Chosen: as much of the UI as practical rendered from JSON schemas and configuration by shared renderers. Rationale: new notification types render with no frontend code and the design system is applied uniformly; the trade-off is more upfront investment in the renderers.</w:t>
+      </w:r>
+    </w:p>
+    <w:p>
+      <w:pPr>
+        <w:numPr>
+          <w:ilvl w:val="0"/>
+          <w:numId w:val="1"/>
+        </w:numPr>
+      </w:pPr>
+      <w:r>
+        <w:t>Module onboarding. Options: a pre-registered allowlist, or automatic discovery. Chosen: modules are discovered automatically on first publish. Rationale: this keeps the backend generic and removes an onboarding step; governance is applied after discovery in the Admin panel.</w:t>
+      </w:r>
+    </w:p>
+    <w:p>
+      <w:pPr>
+        <w:numPr>
+          <w:ilvl w:val="0"/>
+          <w:numId w:val="1"/>
+        </w:numPr>
+      </w:pPr>
+      <w:r>
+        <w:t>AI model hosting. Options: a locally-hosted model (Ollama), a hosted API, or an adapter over both. Chosen: an adapter with a hosted Anthropic (Claude) model as the default, local kept swappable. Rationale: notification content is developer-generated in this environment, so keeping it in-deployment is not required; a hosted model gives substantially better summaries and answers with no local GPU or hardware dependency, and the adapter preserves the option to run locally later.</w:t>
+      </w:r>
+    </w:p>
+    <w:p>
+      <w:pPr>
+        <w:numPr>
+          <w:ilvl w:val="0"/>
+          <w:numId w:val="1"/>
+        </w:numPr>
+      </w:pPr>
+      <w:r>
+        <w:t>AI retrieval. Options: PostgreSQL Full-Text Search, vector embeddings (pgvector), or a hybrid. Chosen: Full-Text Search now, behind a retriever interface, with vector embeddings as a later upgrade. Rationale: FTS unblocks the chatbot immediately with no embedding pipeline, and the interface localizes a later switch to semantic search when time allows.</w:t>
+      </w:r>
+    </w:p>
+    <w:p>
+      <w:pPr>
+        <w:numPr>
+          <w:ilvl w:val="0"/>
+          <w:numId w:val="1"/>
+        </w:numPr>
+      </w:pPr>
+      <w:r>
+        <w:t>Prototype authentication. Options: integrate the host application's identity now, or build a simple auth system for the prototype. Chosen: a simple built-in auth system (users, roles, teams), since the system is not yet embedded in the host application. Rationale: this lets the whole system be built and demonstrated independently, and a clear seam keeps the later switch to host-application identity contained.</w:t>
+      </w:r>
+    </w:p>
+    <w:p>
+      <w:pPr>
+        <w:numPr>
+          <w:ilvl w:val="0"/>
+          <w:numId w:val="1"/>
+        </w:numPr>
+      </w:pPr>
+      <w:r>
+        <w:t>System of record. Among data-store options, PostgreSQL was chosen for notifications, status, configuration, preferences, identity, and audit — for its reliability, rich querying (including full-text search), and time-partitioning.</w:t>
       </w:r>
     </w:p>
     <w:p>
@@ -631,7 +1034,7 @@
     <w:p>
       <w:pPr/>
       <w:r>
-        <w:t>Functional requirements define the specific behaviors the system must perform. Each is tagged with a priority and the delivery milestone (Milestone 1: the frontend feed and its AI features over a basic backend; Milestone 2: the Admin panel, full authorization, and the event-stream intake).</w:t>
+        <w:t>Functional requirements define the specific behaviors the system must perform. Each is tagged with a priority and the delivery week (see the roadmap in Section 1.3).</w:t>
       </w:r>
     </w:p>
     <w:p>
@@ -645,29 +1048,29 @@
         <w:rPr>
           <w:b/>
         </w:rPr>
-        <w:t>FR-1: Generic notification intake</w:t>
-      </w:r>
-    </w:p>
-    <w:p>
-      <w:pPr>
-        <w:numPr>
-          <w:ilvl w:val="0"/>
-          <w:numId w:val="1"/>
-        </w:numPr>
-      </w:pPr>
-      <w:r>
-        <w:t>Description: The system shall accept any well-formed notification from any module through a common, module-agnostic interface, without the module being pre-registered. It shall validate each notification on arrival, handle malformed messages safely without crashing the intake, and lose no accepted notification across a restart.</w:t>
-      </w:r>
-    </w:p>
-    <w:p>
-      <w:pPr>
-        <w:numPr>
-          <w:ilvl w:val="0"/>
-          <w:numId w:val="1"/>
-        </w:numPr>
-      </w:pPr>
-      <w:r>
-        <w:t>Priority: High — Milestone 1</w:t>
+        <w:t>FR-1: Prototype authentication</w:t>
+      </w:r>
+    </w:p>
+    <w:p>
+      <w:pPr>
+        <w:numPr>
+          <w:ilvl w:val="0"/>
+          <w:numId w:val="1"/>
+        </w:numPr>
+      </w:pPr>
+      <w:r>
+        <w:t>Description: The system shall provide a simple built-in authentication mechanism (username and password with a session) for prototyping, with seedable users, roles, and team memberships. In production this is replaced by the host application's identity.</w:t>
+      </w:r>
+    </w:p>
+    <w:p>
+      <w:pPr>
+        <w:numPr>
+          <w:ilvl w:val="0"/>
+          <w:numId w:val="1"/>
+        </w:numPr>
+      </w:pPr>
+      <w:r>
+        <w:t>Priority: High — Week 1</w:t>
       </w:r>
     </w:p>
     <w:p>
@@ -681,29 +1084,29 @@
         <w:rPr>
           <w:b/>
         </w:rPr>
-        <w:t>FR-2: Deduplication</w:t>
-      </w:r>
-    </w:p>
-    <w:p>
-      <w:pPr>
-        <w:numPr>
-          <w:ilvl w:val="0"/>
-          <w:numId w:val="1"/>
-        </w:numPr>
-      </w:pPr>
-      <w:r>
-        <w:t>Description: Each notification carries an id. The system shall treat the id as an idempotency key and process a given notification exactly once, even when the same message is delivered more than once.</w:t>
-      </w:r>
-    </w:p>
-    <w:p>
-      <w:pPr>
-        <w:numPr>
-          <w:ilvl w:val="0"/>
-          <w:numId w:val="1"/>
-        </w:numPr>
-      </w:pPr>
-      <w:r>
-        <w:t>Priority: High — Milestone 1</w:t>
+        <w:t>FR-2: Module simulation</w:t>
+      </w:r>
+    </w:p>
+    <w:p>
+      <w:pPr>
+        <w:numPr>
+          <w:ilvl w:val="0"/>
+          <w:numId w:val="1"/>
+        </w:numPr>
+      </w:pPr>
+      <w:r>
+        <w:t>Description: The system shall provide one or more module simulators that emit notifications across different modules, priorities, and audiences, so the system can be exercised without the real modules.</w:t>
+      </w:r>
+    </w:p>
+    <w:p>
+      <w:pPr>
+        <w:numPr>
+          <w:ilvl w:val="0"/>
+          <w:numId w:val="1"/>
+        </w:numPr>
+      </w:pPr>
+      <w:r>
+        <w:t>Priority: High — Week 1</w:t>
       </w:r>
     </w:p>
     <w:p>
@@ -717,29 +1120,29 @@
         <w:rPr>
           <w:b/>
         </w:rPr>
-        <w:t>FR-3: Policy enforcement</w:t>
-      </w:r>
-    </w:p>
-    <w:p>
-      <w:pPr>
-        <w:numPr>
-          <w:ilvl w:val="0"/>
-          <w:numId w:val="1"/>
-        </w:numPr>
-      </w:pPr>
-      <w:r>
-        <w:t>Description: Before delivering a notification, the system shall apply centrally-administered policy — module enable/disable, feature availability, priority ceiling, rate limit, and snooze — on the server. The enforcement engine operates with safe defaults from the first milestone; administrator-managed configuration of this policy arrives in the second milestone.</w:t>
-      </w:r>
-    </w:p>
-    <w:p>
-      <w:pPr>
-        <w:numPr>
-          <w:ilvl w:val="0"/>
-          <w:numId w:val="1"/>
-        </w:numPr>
-      </w:pPr>
-      <w:r>
-        <w:t>Priority: High — Milestones 1 and 2</w:t>
+        <w:t>FR-3: Generic notification intake</w:t>
+      </w:r>
+    </w:p>
+    <w:p>
+      <w:pPr>
+        <w:numPr>
+          <w:ilvl w:val="0"/>
+          <w:numId w:val="1"/>
+        </w:numPr>
+      </w:pPr>
+      <w:r>
+        <w:t>Description: The system shall accept any well-formed notification from any module without the module being pre-registered, validate it on arrival, handle malformed messages safely without crashing, and lose no accepted notification across a restart.</w:t>
+      </w:r>
+    </w:p>
+    <w:p>
+      <w:pPr>
+        <w:numPr>
+          <w:ilvl w:val="0"/>
+          <w:numId w:val="1"/>
+        </w:numPr>
+      </w:pPr>
+      <w:r>
+        <w:t>Priority: High — Week 1</w:t>
       </w:r>
     </w:p>
     <w:p>
@@ -753,29 +1156,29 @@
         <w:rPr>
           <w:b/>
         </w:rPr>
-        <w:t>FR-4: Per-user preference enforcement</w:t>
-      </w:r>
-    </w:p>
-    <w:p>
-      <w:pPr>
-        <w:numPr>
-          <w:ilvl w:val="0"/>
-          <w:numId w:val="1"/>
-        </w:numPr>
-      </w:pPr>
-      <w:r>
-        <w:t>Description: The system shall apply each user's own preferences, layered beneath the global policy. Suppressions stack: a global disable or snooze always takes precedence, and a per-user setting may only further restrict what a user receives, never re-enable something disabled globally.</w:t>
-      </w:r>
-    </w:p>
-    <w:p>
-      <w:pPr>
-        <w:numPr>
-          <w:ilvl w:val="0"/>
-          <w:numId w:val="1"/>
-        </w:numPr>
-      </w:pPr>
-      <w:r>
-        <w:t>Priority: High — Milestone 1</w:t>
+        <w:t>FR-4: Deduplication</w:t>
+      </w:r>
+    </w:p>
+    <w:p>
+      <w:pPr>
+        <w:numPr>
+          <w:ilvl w:val="0"/>
+          <w:numId w:val="1"/>
+        </w:numPr>
+      </w:pPr>
+      <w:r>
+        <w:t>Description: The system shall treat the notification id as an idempotency key and process a given notification once.</w:t>
+      </w:r>
+    </w:p>
+    <w:p>
+      <w:pPr>
+        <w:numPr>
+          <w:ilvl w:val="0"/>
+          <w:numId w:val="1"/>
+        </w:numPr>
+      </w:pPr>
+      <w:r>
+        <w:t>Priority: High — Week 1</w:t>
       </w:r>
     </w:p>
     <w:p>
@@ -800,18 +1203,18 @@
         </w:numPr>
       </w:pPr>
       <w:r>
-        <w:t>Description: The system shall deliver new and updated notifications to the logged-in user in real time, coalescing bursts of activity into batched updates.</w:t>
-      </w:r>
-    </w:p>
-    <w:p>
-      <w:pPr>
-        <w:numPr>
-          <w:ilvl w:val="0"/>
-          <w:numId w:val="1"/>
-        </w:numPr>
-      </w:pPr>
-      <w:r>
-        <w:t>Priority: High — Milestone 1</w:t>
+        <w:t>Description: The system shall deliver new and updated notifications to the logged-in user in real time.</w:t>
+      </w:r>
+    </w:p>
+    <w:p>
+      <w:pPr>
+        <w:numPr>
+          <w:ilvl w:val="0"/>
+          <w:numId w:val="1"/>
+        </w:numPr>
+      </w:pPr>
+      <w:r>
+        <w:t>Priority: High — Week 1</w:t>
       </w:r>
     </w:p>
     <w:p>
@@ -836,18 +1239,18 @@
         </w:numPr>
       </w:pPr>
       <w:r>
-        <w:t>Description: The system shall record each notification's delivery and read state (e.g. delivered, read, dismissed, snoozed) as a durable fact, stored separately from the notification itself.</w:t>
-      </w:r>
-    </w:p>
-    <w:p>
-      <w:pPr>
-        <w:numPr>
-          <w:ilvl w:val="0"/>
-          <w:numId w:val="1"/>
-        </w:numPr>
-      </w:pPr>
-      <w:r>
-        <w:t>Priority: Medium — Milestone 1</w:t>
+        <w:t>Description: The system shall record each notification's delivery and read state (delivered, read, dismissed, snoozed) as durable data, stored separately from the notification.</w:t>
+      </w:r>
+    </w:p>
+    <w:p>
+      <w:pPr>
+        <w:numPr>
+          <w:ilvl w:val="0"/>
+          <w:numId w:val="1"/>
+        </w:numPr>
+      </w:pPr>
+      <w:r>
+        <w:t>Priority: Medium — Week 1</w:t>
       </w:r>
     </w:p>
     <w:p>
@@ -872,18 +1275,18 @@
         </w:numPr>
       </w:pPr>
       <w:r>
-        <w:t>Description: The system shall record each publishing module the first time it sends a notification, so the set of active modules is known without pre-registration; these modules are surfaced in the Admin panel in the second milestone.</w:t>
-      </w:r>
-    </w:p>
-    <w:p>
-      <w:pPr>
-        <w:numPr>
-          <w:ilvl w:val="0"/>
-          <w:numId w:val="1"/>
-        </w:numPr>
-      </w:pPr>
-      <w:r>
-        <w:t>Priority: Medium — Milestone 1</w:t>
+        <w:t>Description: The system shall record each publishing module the first time it publishes, so it can be governed.</w:t>
+      </w:r>
+    </w:p>
+    <w:p>
+      <w:pPr>
+        <w:numPr>
+          <w:ilvl w:val="0"/>
+          <w:numId w:val="1"/>
+        </w:numPr>
+      </w:pPr>
+      <w:r>
+        <w:t>Priority: Medium — Week 2</w:t>
       </w:r>
     </w:p>
     <w:p>
@@ -897,29 +1300,29 @@
         <w:rPr>
           <w:b/>
         </w:rPr>
-        <w:t>FR-8: Categorization</w:t>
-      </w:r>
-    </w:p>
-    <w:p>
-      <w:pPr>
-        <w:numPr>
-          <w:ilvl w:val="0"/>
-          <w:numId w:val="1"/>
-        </w:numPr>
-      </w:pPr>
-      <w:r>
-        <w:t>Description: The system shall categorize notifications by originating module and functional domain so they can be presented in coherent groups.</w:t>
-      </w:r>
-    </w:p>
-    <w:p>
-      <w:pPr>
-        <w:numPr>
-          <w:ilvl w:val="0"/>
-          <w:numId w:val="1"/>
-        </w:numPr>
-      </w:pPr>
-      <w:r>
-        <w:t>Priority: Medium — Milestone 1</w:t>
+        <w:t>FR-8: Basic administration</w:t>
+      </w:r>
+    </w:p>
+    <w:p>
+      <w:pPr>
+        <w:numPr>
+          <w:ilvl w:val="0"/>
+          <w:numId w:val="1"/>
+        </w:numPr>
+      </w:pPr>
+      <w:r>
+        <w:t>Description: The system shall provide an Admin panel that lets an administrator enable or disable a module and switch major features on or off for everyone, enforced on the server before delivery.</w:t>
+      </w:r>
+    </w:p>
+    <w:p>
+      <w:pPr>
+        <w:numPr>
+          <w:ilvl w:val="0"/>
+          <w:numId w:val="1"/>
+        </w:numPr>
+      </w:pPr>
+      <w:r>
+        <w:t>Priority: High — Week 2</w:t>
       </w:r>
     </w:p>
     <w:p>
@@ -933,29 +1336,29 @@
         <w:rPr>
           <w:b/>
         </w:rPr>
-        <w:t>FR-9: Similar-notification grouping</w:t>
-      </w:r>
-    </w:p>
-    <w:p>
-      <w:pPr>
-        <w:numPr>
-          <w:ilvl w:val="0"/>
-          <w:numId w:val="1"/>
-        </w:numPr>
-      </w:pPr>
-      <w:r>
-        <w:t>Description: The system shall group related notifications (for example, a run of messages of the same kind) into a single thread, using text and metadata matching, so a burst of related items reads as one entry. Grouping is performed server-side.</w:t>
-      </w:r>
-    </w:p>
-    <w:p>
-      <w:pPr>
-        <w:numPr>
-          <w:ilvl w:val="0"/>
-          <w:numId w:val="1"/>
-        </w:numPr>
-      </w:pPr>
-      <w:r>
-        <w:t>Priority: Medium — Milestone 1</w:t>
+        <w:t>FR-9: Categorization</w:t>
+      </w:r>
+    </w:p>
+    <w:p>
+      <w:pPr>
+        <w:numPr>
+          <w:ilvl w:val="0"/>
+          <w:numId w:val="1"/>
+        </w:numPr>
+      </w:pPr>
+      <w:r>
+        <w:t>Description: The system shall categorize notifications by originating module and functional domain.</w:t>
+      </w:r>
+    </w:p>
+    <w:p>
+      <w:pPr>
+        <w:numPr>
+          <w:ilvl w:val="0"/>
+          <w:numId w:val="1"/>
+        </w:numPr>
+      </w:pPr>
+      <w:r>
+        <w:t>Priority: Medium — Week 2</w:t>
       </w:r>
     </w:p>
     <w:p>
@@ -980,18 +1383,18 @@
         </w:numPr>
       </w:pPr>
       <w:r>
-        <w:t>Description: The system shall order notifications by priority, showing higher-priority items first.</w:t>
-      </w:r>
-    </w:p>
-    <w:p>
-      <w:pPr>
-        <w:numPr>
-          <w:ilvl w:val="0"/>
-          <w:numId w:val="1"/>
-        </w:numPr>
-      </w:pPr>
-      <w:r>
-        <w:t>Priority: Medium — Milestone 1</w:t>
+        <w:t>Description: The system shall order the feed by priority, showing higher-priority notifications first.</w:t>
+      </w:r>
+    </w:p>
+    <w:p>
+      <w:pPr>
+        <w:numPr>
+          <w:ilvl w:val="0"/>
+          <w:numId w:val="1"/>
+        </w:numPr>
+      </w:pPr>
+      <w:r>
+        <w:t>Priority: Medium — Week 2</w:t>
       </w:r>
     </w:p>
     <w:p>
@@ -1016,18 +1419,18 @@
         </w:numPr>
       </w:pPr>
       <w:r>
-        <w:t>Description: The system shall allow a user to filter their notifications by attributes including originating module, category, date, and keyword. Filtering is performed server-side.</w:t>
-      </w:r>
-    </w:p>
-    <w:p>
-      <w:pPr>
-        <w:numPr>
-          <w:ilvl w:val="0"/>
-          <w:numId w:val="1"/>
-        </w:numPr>
-      </w:pPr>
-      <w:r>
-        <w:t>Priority: Medium — Milestone 1</w:t>
+        <w:t>Description: The system shall let a user filter notifications by module, category, date, and keyword.</w:t>
+      </w:r>
+    </w:p>
+    <w:p>
+      <w:pPr>
+        <w:numPr>
+          <w:ilvl w:val="0"/>
+          <w:numId w:val="1"/>
+        </w:numPr>
+      </w:pPr>
+      <w:r>
+        <w:t>Priority: Medium — Week 2</w:t>
       </w:r>
     </w:p>
     <w:p>
@@ -1041,29 +1444,29 @@
         <w:rPr>
           <w:b/>
         </w:rPr>
-        <w:t>FR-12: Snoozing</w:t>
-      </w:r>
-    </w:p>
-    <w:p>
-      <w:pPr>
-        <w:numPr>
-          <w:ilvl w:val="0"/>
-          <w:numId w:val="1"/>
-        </w:numPr>
-      </w:pPr>
-      <w:r>
-        <w:t>Description: The system shall let a user temporarily silence notifications by type and originating module; snoozing is enforced on the server.</w:t>
-      </w:r>
-    </w:p>
-    <w:p>
-      <w:pPr>
-        <w:numPr>
-          <w:ilvl w:val="0"/>
-          <w:numId w:val="1"/>
-        </w:numPr>
-      </w:pPr>
-      <w:r>
-        <w:t>Priority: Medium — Milestone 1</w:t>
+        <w:t>FR-12: Incremental feed loading</w:t>
+      </w:r>
+    </w:p>
+    <w:p>
+      <w:pPr>
+        <w:numPr>
+          <w:ilvl w:val="0"/>
+          <w:numId w:val="1"/>
+        </w:numPr>
+      </w:pPr>
+      <w:r>
+        <w:t>Description: The system shall load the feed incrementally so it stays responsive when a user has very many notifications.</w:t>
+      </w:r>
+    </w:p>
+    <w:p>
+      <w:pPr>
+        <w:numPr>
+          <w:ilvl w:val="0"/>
+          <w:numId w:val="1"/>
+        </w:numPr>
+      </w:pPr>
+      <w:r>
+        <w:t>Priority: High — Week 2</w:t>
       </w:r>
     </w:p>
     <w:p>
@@ -1088,18 +1491,18 @@
         </w:numPr>
       </w:pPr>
       <w:r>
-        <w:t>Description: The system shall summarize a set of unread notifications into a concise digest, available both on demand and on a schedule.</w:t>
-      </w:r>
-    </w:p>
-    <w:p>
-      <w:pPr>
-        <w:numPr>
-          <w:ilvl w:val="0"/>
-          <w:numId w:val="1"/>
-        </w:numPr>
-      </w:pPr>
-      <w:r>
-        <w:t>Priority: Medium — Milestone 1</w:t>
+        <w:t>Description: The system shall summarize a user's unread notifications into a concise digest, available on demand and on a schedule.</w:t>
+      </w:r>
+    </w:p>
+    <w:p>
+      <w:pPr>
+        <w:numPr>
+          <w:ilvl w:val="0"/>
+          <w:numId w:val="1"/>
+        </w:numPr>
+      </w:pPr>
+      <w:r>
+        <w:t>Priority: Medium — Week 3</w:t>
       </w:r>
     </w:p>
     <w:p>
@@ -1113,29 +1516,29 @@
         <w:rPr>
           <w:b/>
         </w:rPr>
-        <w:t>FR-14: AI question-and-answer chatbot</w:t>
-      </w:r>
-    </w:p>
-    <w:p>
-      <w:pPr>
-        <w:numPr>
-          <w:ilvl w:val="0"/>
-          <w:numId w:val="1"/>
-        </w:numPr>
-      </w:pPr>
-      <w:r>
-        <w:t>Description: The system shall provide a chatbot that answers a user's natural-language questions about their own notification history, preserving conversational context.</w:t>
-      </w:r>
-    </w:p>
-    <w:p>
-      <w:pPr>
-        <w:numPr>
-          <w:ilvl w:val="0"/>
-          <w:numId w:val="1"/>
-        </w:numPr>
-      </w:pPr>
-      <w:r>
-        <w:t>Priority: Medium — Milestone 1</w:t>
+        <w:t>FR-14: AI question-and-answer</w:t>
+      </w:r>
+    </w:p>
+    <w:p>
+      <w:pPr>
+        <w:numPr>
+          <w:ilvl w:val="0"/>
+          <w:numId w:val="1"/>
+        </w:numPr>
+      </w:pPr>
+      <w:r>
+        <w:t>Description: The system shall answer a user's natural-language questions about their own notification history, preserving conversational context.</w:t>
+      </w:r>
+    </w:p>
+    <w:p>
+      <w:pPr>
+        <w:numPr>
+          <w:ilvl w:val="0"/>
+          <w:numId w:val="1"/>
+        </w:numPr>
+      </w:pPr>
+      <w:r>
+        <w:t>Priority: Medium — Week 3</w:t>
       </w:r>
     </w:p>
     <w:p>
@@ -1149,29 +1552,29 @@
         <w:rPr>
           <w:b/>
         </w:rPr>
-        <w:t>FR-15: Actionable notifications</w:t>
-      </w:r>
-    </w:p>
-    <w:p>
-      <w:pPr>
-        <w:numPr>
-          <w:ilvl w:val="0"/>
-          <w:numId w:val="1"/>
-        </w:numPr>
-      </w:pPr>
-      <w:r>
-        <w:t>Description: The system shall present actions on a notification (e.g. reply, dismiss) that the user can invoke from the feed; each action calls back to the originating module, which owns the action's authorization.</w:t>
-      </w:r>
-    </w:p>
-    <w:p>
-      <w:pPr>
-        <w:numPr>
-          <w:ilvl w:val="0"/>
-          <w:numId w:val="1"/>
-        </w:numPr>
-      </w:pPr>
-      <w:r>
-        <w:t>Priority: Medium — Milestone 1</w:t>
+        <w:t>FR-15: AI administration</w:t>
+      </w:r>
+    </w:p>
+    <w:p>
+      <w:pPr>
+        <w:numPr>
+          <w:ilvl w:val="0"/>
+          <w:numId w:val="1"/>
+        </w:numPr>
+      </w:pPr>
+      <w:r>
+        <w:t>Description: The system shall let an administrator enable or disable the AI features, choose the summarization mode (on demand, scheduled, or both), and, when scheduled, set its frequency.</w:t>
+      </w:r>
+    </w:p>
+    <w:p>
+      <w:pPr>
+        <w:numPr>
+          <w:ilvl w:val="0"/>
+          <w:numId w:val="1"/>
+        </w:numPr>
+      </w:pPr>
+      <w:r>
+        <w:t>Priority: Medium — Week 3</w:t>
       </w:r>
     </w:p>
     <w:p>
@@ -1185,29 +1588,29 @@
         <w:rPr>
           <w:b/>
         </w:rPr>
-        <w:t>FR-16: Navigate to originating module</w:t>
-      </w:r>
-    </w:p>
-    <w:p>
-      <w:pPr>
-        <w:numPr>
-          <w:ilvl w:val="0"/>
-          <w:numId w:val="1"/>
-        </w:numPr>
-      </w:pPr>
-      <w:r>
-        <w:t>Description: The system shall allow a user to open a notification and navigate to its originating module.</w:t>
-      </w:r>
-    </w:p>
-    <w:p>
-      <w:pPr>
-        <w:numPr>
-          <w:ilvl w:val="0"/>
-          <w:numId w:val="1"/>
-        </w:numPr>
-      </w:pPr>
-      <w:r>
-        <w:t>Priority: Low — Milestone 1</w:t>
+        <w:t>FR-16: Audience targeting</w:t>
+      </w:r>
+    </w:p>
+    <w:p>
+      <w:pPr>
+        <w:numPr>
+          <w:ilvl w:val="0"/>
+          <w:numId w:val="1"/>
+        </w:numPr>
+      </w:pPr>
+      <w:r>
+        <w:t>Description: The system shall deliver each notification to its audience: the whole company (global), the members of a team, the users holding a role, or a single user.</w:t>
+      </w:r>
+    </w:p>
+    <w:p>
+      <w:pPr>
+        <w:numPr>
+          <w:ilvl w:val="0"/>
+          <w:numId w:val="1"/>
+        </w:numPr>
+      </w:pPr>
+      <w:r>
+        <w:t>Priority: High — Week 4</w:t>
       </w:r>
     </w:p>
     <w:p>
@@ -1221,29 +1624,29 @@
         <w:rPr>
           <w:b/>
         </w:rPr>
-        <w:t>FR-17: Per-user preferences panel</w:t>
-      </w:r>
-    </w:p>
-    <w:p>
-      <w:pPr>
-        <w:numPr>
-          <w:ilvl w:val="0"/>
-          <w:numId w:val="1"/>
-        </w:numPr>
-      </w:pPr>
-      <w:r>
-        <w:t>Description: The system shall provide a per-user preferences panel, rendered from JSON form schemas, that lets a user manage their own notification settings beneath the global policy.</w:t>
-      </w:r>
-    </w:p>
-    <w:p>
-      <w:pPr>
-        <w:numPr>
-          <w:ilvl w:val="0"/>
-          <w:numId w:val="1"/>
-        </w:numPr>
-      </w:pPr>
-      <w:r>
-        <w:t>Priority: Medium — Milestone 1</w:t>
+        <w:t>FR-17: Per-user preferences</w:t>
+      </w:r>
+    </w:p>
+    <w:p>
+      <w:pPr>
+        <w:numPr>
+          <w:ilvl w:val="0"/>
+          <w:numId w:val="1"/>
+        </w:numPr>
+      </w:pPr>
+      <w:r>
+        <w:t>Description: The system shall provide a per-user preferences panel and apply those preferences beneath the global administrator policy, with suppressions stacking — a global disable always wins.</w:t>
+      </w:r>
+    </w:p>
+    <w:p>
+      <w:pPr>
+        <w:numPr>
+          <w:ilvl w:val="0"/>
+          <w:numId w:val="1"/>
+        </w:numPr>
+      </w:pPr>
+      <w:r>
+        <w:t>Priority: High — Week 4</w:t>
       </w:r>
     </w:p>
     <w:p>
@@ -1257,29 +1660,29 @@
         <w:rPr>
           <w:b/>
         </w:rPr>
-        <w:t>FR-18: Incremental feed loading</w:t>
-      </w:r>
-    </w:p>
-    <w:p>
-      <w:pPr>
-        <w:numPr>
-          <w:ilvl w:val="0"/>
-          <w:numId w:val="1"/>
-        </w:numPr>
-      </w:pPr>
-      <w:r>
-        <w:t>Description: The system shall load the feed incrementally using server-side keyset pagination and render it with list virtualization and infinite scroll, so the feed remains responsive when a user has a very large number of notifications.</w:t>
-      </w:r>
-    </w:p>
-    <w:p>
-      <w:pPr>
-        <w:numPr>
-          <w:ilvl w:val="0"/>
-          <w:numId w:val="1"/>
-        </w:numPr>
-      </w:pPr>
-      <w:r>
-        <w:t>Priority: High — Milestone 1</w:t>
+        <w:t>FR-18: Similar-notification grouping</w:t>
+      </w:r>
+    </w:p>
+    <w:p>
+      <w:pPr>
+        <w:numPr>
+          <w:ilvl w:val="0"/>
+          <w:numId w:val="1"/>
+        </w:numPr>
+      </w:pPr>
+      <w:r>
+        <w:t>Description: The system shall group related notifications into a single thread so a burst of related items reads as one entry.</w:t>
+      </w:r>
+    </w:p>
+    <w:p>
+      <w:pPr>
+        <w:numPr>
+          <w:ilvl w:val="0"/>
+          <w:numId w:val="1"/>
+        </w:numPr>
+      </w:pPr>
+      <w:r>
+        <w:t>Priority: Medium — Week 4</w:t>
       </w:r>
     </w:p>
     <w:p>
@@ -1293,29 +1696,29 @@
         <w:rPr>
           <w:b/>
         </w:rPr>
-        <w:t>FR-19: Per-module governance</w:t>
-      </w:r>
-    </w:p>
-    <w:p>
-      <w:pPr>
-        <w:numPr>
-          <w:ilvl w:val="0"/>
-          <w:numId w:val="1"/>
-        </w:numPr>
-      </w:pPr>
-      <w:r>
-        <w:t>Description: The Admin panel shall let an administrator, per module, enable or disable it, set a priority ceiling, set a rate limit, snooze it for all users (with an expiry), and disable its actions.</w:t>
-      </w:r>
-    </w:p>
-    <w:p>
-      <w:pPr>
-        <w:numPr>
-          <w:ilvl w:val="0"/>
-          <w:numId w:val="1"/>
-        </w:numPr>
-      </w:pPr>
-      <w:r>
-        <w:t>Priority: High — Milestone 2</w:t>
+        <w:t>FR-19: Snoozing</w:t>
+      </w:r>
+    </w:p>
+    <w:p>
+      <w:pPr>
+        <w:numPr>
+          <w:ilvl w:val="0"/>
+          <w:numId w:val="1"/>
+        </w:numPr>
+      </w:pPr>
+      <w:r>
+        <w:t>Description: The system shall let a user temporarily silence notifications by type and originating module.</w:t>
+      </w:r>
+    </w:p>
+    <w:p>
+      <w:pPr>
+        <w:numPr>
+          <w:ilvl w:val="0"/>
+          <w:numId w:val="1"/>
+        </w:numPr>
+      </w:pPr>
+      <w:r>
+        <w:t>Priority: Medium — Week 4</w:t>
       </w:r>
     </w:p>
     <w:p>
@@ -1329,29 +1732,29 @@
         <w:rPr>
           <w:b/>
         </w:rPr>
-        <w:t>FR-20: Feature kill-switches</w:t>
-      </w:r>
-    </w:p>
-    <w:p>
-      <w:pPr>
-        <w:numPr>
-          <w:ilvl w:val="0"/>
-          <w:numId w:val="1"/>
-        </w:numPr>
-      </w:pPr>
-      <w:r>
-        <w:t>Description: The Admin panel shall provide independent global toggles to enable or disable each major feature — AI summarization, the question-and-answer chatbot, similar-notification grouping, and inline actions.</w:t>
-      </w:r>
-    </w:p>
-    <w:p>
-      <w:pPr>
-        <w:numPr>
-          <w:ilvl w:val="0"/>
-          <w:numId w:val="1"/>
-        </w:numPr>
-      </w:pPr>
-      <w:r>
-        <w:t>Priority: Medium — Milestone 2</w:t>
+        <w:t>FR-20: Actionable notifications</w:t>
+      </w:r>
+    </w:p>
+    <w:p>
+      <w:pPr>
+        <w:numPr>
+          <w:ilvl w:val="0"/>
+          <w:numId w:val="1"/>
+        </w:numPr>
+      </w:pPr>
+      <w:r>
+        <w:t>Description: The system shall present actions on a notification (e.g., reply, dismiss) that call back to the originating module — its simulator in the prototype — which owns the action's authorization.</w:t>
+      </w:r>
+    </w:p>
+    <w:p>
+      <w:pPr>
+        <w:numPr>
+          <w:ilvl w:val="0"/>
+          <w:numId w:val="1"/>
+        </w:numPr>
+      </w:pPr>
+      <w:r>
+        <w:t>Priority: Medium — Week 4</w:t>
       </w:r>
     </w:p>
     <w:p>
@@ -1365,29 +1768,29 @@
         <w:rPr>
           <w:b/>
         </w:rPr>
-        <w:t>FR-21: AI summarization configuration</w:t>
-      </w:r>
-    </w:p>
-    <w:p>
-      <w:pPr>
-        <w:numPr>
-          <w:ilvl w:val="0"/>
-          <w:numId w:val="1"/>
-        </w:numPr>
-      </w:pPr>
-      <w:r>
-        <w:t>Description: The Admin panel shall let an administrator enable or disable AI summarization, choose its mode (on demand, scheduled, or both), and, when scheduled, set its frequency, informed by resource usage.</w:t>
-      </w:r>
-    </w:p>
-    <w:p>
-      <w:pPr>
-        <w:numPr>
-          <w:ilvl w:val="0"/>
-          <w:numId w:val="1"/>
-        </w:numPr>
-      </w:pPr>
-      <w:r>
-        <w:t>Priority: Medium — Milestone 2</w:t>
+        <w:t>FR-21: Navigate to originating module</w:t>
+      </w:r>
+    </w:p>
+    <w:p>
+      <w:pPr>
+        <w:numPr>
+          <w:ilvl w:val="0"/>
+          <w:numId w:val="1"/>
+        </w:numPr>
+      </w:pPr>
+      <w:r>
+        <w:t>Description: The system shall let a user open a notification to navigate to its source.</w:t>
+      </w:r>
+    </w:p>
+    <w:p>
+      <w:pPr>
+        <w:numPr>
+          <w:ilvl w:val="0"/>
+          <w:numId w:val="1"/>
+        </w:numPr>
+      </w:pPr>
+      <w:r>
+        <w:t>Priority: Low — Week 4</w:t>
       </w:r>
     </w:p>
     <w:p>
@@ -1401,29 +1804,29 @@
         <w:rPr>
           <w:b/>
         </w:rPr>
-        <w:t>FR-22: Resource-usage and observability</w:t>
-      </w:r>
-    </w:p>
-    <w:p>
-      <w:pPr>
-        <w:numPr>
-          <w:ilvl w:val="0"/>
-          <w:numId w:val="1"/>
-        </w:numPr>
-      </w:pPr>
-      <w:r>
-        <w:t>Description: The Admin panel shall surface AI resource usage (e.g. run count, tokens, CPU/GPU/memory) to inform scheduling, and per-module health (volume, failures, dead-letter counts).</w:t>
-      </w:r>
-    </w:p>
-    <w:p>
-      <w:pPr>
-        <w:numPr>
-          <w:ilvl w:val="0"/>
-          <w:numId w:val="1"/>
-        </w:numPr>
-      </w:pPr>
-      <w:r>
-        <w:t>Priority: Medium — Milestone 2</w:t>
+        <w:t>FR-22: Per-module governance (expanded)</w:t>
+      </w:r>
+    </w:p>
+    <w:p>
+      <w:pPr>
+        <w:numPr>
+          <w:ilvl w:val="0"/>
+          <w:numId w:val="1"/>
+        </w:numPr>
+      </w:pPr>
+      <w:r>
+        <w:t>Description: The Admin panel shall let an administrator set a per-module priority ceiling and rate limit, snooze a module for everyone (with an expiry), and disable a module's actions.</w:t>
+      </w:r>
+    </w:p>
+    <w:p>
+      <w:pPr>
+        <w:numPr>
+          <w:ilvl w:val="0"/>
+          <w:numId w:val="1"/>
+        </w:numPr>
+      </w:pPr>
+      <w:r>
+        <w:t>Priority: Medium — Week 5</w:t>
       </w:r>
     </w:p>
     <w:p>
@@ -1448,18 +1851,18 @@
         </w:numPr>
       </w:pPr>
       <w:r>
-        <w:t>Description: The Admin panel shall let an administrator compose and push a system-wide announcement through the same delivery pipeline as module notifications.</w:t>
-      </w:r>
-    </w:p>
-    <w:p>
-      <w:pPr>
-        <w:numPr>
-          <w:ilvl w:val="0"/>
-          <w:numId w:val="1"/>
-        </w:numPr>
-      </w:pPr>
-      <w:r>
-        <w:t>Priority: Medium — Milestone 2</w:t>
+        <w:t>Description: The Admin panel shall let an administrator compose and send a system-wide announcement through the delivery pipeline.</w:t>
+      </w:r>
+    </w:p>
+    <w:p>
+      <w:pPr>
+        <w:numPr>
+          <w:ilvl w:val="0"/>
+          <w:numId w:val="1"/>
+        </w:numPr>
+      </w:pPr>
+      <w:r>
+        <w:t>Priority: Medium — Week 5</w:t>
       </w:r>
     </w:p>
     <w:p>
@@ -1473,29 +1876,29 @@
         <w:rPr>
           <w:b/>
         </w:rPr>
-        <w:t>FR-24: Dead-letter management</w:t>
-      </w:r>
-    </w:p>
-    <w:p>
-      <w:pPr>
-        <w:numPr>
-          <w:ilvl w:val="0"/>
-          <w:numId w:val="1"/>
-        </w:numPr>
-      </w:pPr>
-      <w:r>
-        <w:t>Description: The Admin panel shall let an administrator view notifications that failed processing or were malformed, retry or discard them, and configure alert thresholds. This is delivered with the event-stream intake path.</w:t>
-      </w:r>
-    </w:p>
-    <w:p>
-      <w:pPr>
-        <w:numPr>
-          <w:ilvl w:val="0"/>
-          <w:numId w:val="1"/>
-        </w:numPr>
-      </w:pPr>
-      <w:r>
-        <w:t>Priority: Medium — Milestone 2</w:t>
+        <w:t>FR-24: Resource-usage and observability</w:t>
+      </w:r>
+    </w:p>
+    <w:p>
+      <w:pPr>
+        <w:numPr>
+          <w:ilvl w:val="0"/>
+          <w:numId w:val="1"/>
+        </w:numPr>
+      </w:pPr>
+      <w:r>
+        <w:t>Description: The Admin panel shall show AI resource usage (to inform scheduling) and per-module health (volume, failures, dead-letter counts).</w:t>
+      </w:r>
+    </w:p>
+    <w:p>
+      <w:pPr>
+        <w:numPr>
+          <w:ilvl w:val="0"/>
+          <w:numId w:val="1"/>
+        </w:numPr>
+      </w:pPr>
+      <w:r>
+        <w:t>Priority: Medium — Week 5</w:t>
       </w:r>
     </w:p>
     <w:p>
@@ -1531,7 +1934,7 @@
         </w:numPr>
       </w:pPr>
       <w:r>
-        <w:t>Priority: Medium — Milestone 2</w:t>
+        <w:t>Priority: Medium — Week 5</w:t>
       </w:r>
     </w:p>
     <w:p>
@@ -1556,18 +1959,18 @@
         </w:numPr>
       </w:pPr>
       <w:r>
-        <w:t>Description: The Admin panel shall let an administrator export the administrative configuration as a single artifact and import, diff, or promote it between environments.</w:t>
-      </w:r>
-    </w:p>
-    <w:p>
-      <w:pPr>
-        <w:numPr>
-          <w:ilvl w:val="0"/>
-          <w:numId w:val="1"/>
-        </w:numPr>
-      </w:pPr>
-      <w:r>
-        <w:t>Priority: Low — Milestone 2</w:t>
+        <w:t>Description: The Admin panel shall let an administrator export the administrative configuration as a single artifact and import, diff, or promote it.</w:t>
+      </w:r>
+    </w:p>
+    <w:p>
+      <w:pPr>
+        <w:numPr>
+          <w:ilvl w:val="0"/>
+          <w:numId w:val="1"/>
+        </w:numPr>
+      </w:pPr>
+      <w:r>
+        <w:t>Priority: Low — Week 5</w:t>
       </w:r>
     </w:p>
     <w:p>
@@ -1592,18 +1995,18 @@
         </w:numPr>
       </w:pPr>
       <w:r>
-        <w:t>Description: The Admin panel shall provide global controls — quiet hours, a maintenance mode, and a master pause — with exceptions for critical-priority notifications.</w:t>
-      </w:r>
-    </w:p>
-    <w:p>
-      <w:pPr>
-        <w:numPr>
-          <w:ilvl w:val="0"/>
-          <w:numId w:val="1"/>
-        </w:numPr>
-      </w:pPr>
-      <w:r>
-        <w:t>Priority: Low — Milestone 2</w:t>
+        <w:t>Description: The Admin panel shall provide global controls — quiet hours, a maintenance mode, and a master pause — with exceptions for critical notifications.</w:t>
+      </w:r>
+    </w:p>
+    <w:p>
+      <w:pPr>
+        <w:numPr>
+          <w:ilvl w:val="0"/>
+          <w:numId w:val="1"/>
+        </w:numPr>
+      </w:pPr>
+      <w:r>
+        <w:t>Priority: Low — Week 5</w:t>
       </w:r>
     </w:p>
     <w:p>
@@ -1617,7 +2020,7 @@
         <w:rPr>
           <w:b/>
         </w:rPr>
-        <w:t>FR-28: Notification time-to-live and lifecycle</w:t>
+        <w:t>FR-28: Notification lifecycle</w:t>
       </w:r>
     </w:p>
     <w:p>
@@ -1639,7 +2042,43 @@
         </w:numPr>
       </w:pPr>
       <w:r>
-        <w:t>Priority: Low — Milestone 2</w:t>
+        <w:t>Priority: Low — Week 5</w:t>
+      </w:r>
+    </w:p>
+    <w:p>
+      <w:pPr>
+        <w:numPr>
+          <w:ilvl w:val="0"/>
+          <w:numId w:val="1"/>
+        </w:numPr>
+      </w:pPr>
+      <w:r>
+        <w:rPr>
+          <w:b/>
+        </w:rPr>
+        <w:t>FR-29: Dead-letter management</w:t>
+      </w:r>
+    </w:p>
+    <w:p>
+      <w:pPr>
+        <w:numPr>
+          <w:ilvl w:val="0"/>
+          <w:numId w:val="1"/>
+        </w:numPr>
+      </w:pPr>
+      <w:r>
+        <w:t>Description: Once the durable event-stream intake is in place, the Admin panel shall let an administrator view notifications that failed processing and retry or discard them.</w:t>
+      </w:r>
+    </w:p>
+    <w:p>
+      <w:pPr>
+        <w:numPr>
+          <w:ilvl w:val="0"/>
+          <w:numId w:val="1"/>
+        </w:numPr>
+      </w:pPr>
+      <w:r>
+        <w:t>Priority: Medium — Week 5</w:t>
       </w:r>
     </w:p>
     <w:p>
@@ -1653,84 +2092,84 @@
     <w:p>
       <w:pPr/>
       <w:r>
-        <w:t>Non-functional requirements describe how the system should behave. Concrete performance, scalability, and availability service-level targets are intentionally deferred until the system is running and they can be measured; the performance engineering approach, however, is a first-class requirement (NFR-2).</w:t>
-      </w:r>
-    </w:p>
-    <w:p>
-      <w:pPr>
-        <w:numPr>
-          <w:ilvl w:val="0"/>
-          <w:numId w:val="1"/>
-        </w:numPr>
-      </w:pPr>
-      <w:r>
-        <w:t>NFR-1 (Reliability): Notification intake shall be at-least-once with de-duplication on the notification id, retry failed processing, hold repeatedly-failing messages in a dead-letter area, and lose no accepted notification across a restart. The basic-backend intake must not lose or duplicate notifications; the full dead-letter path is delivered with the event-stream intake.</w:t>
-      </w:r>
-    </w:p>
-    <w:p>
-      <w:pPr>
-        <w:numPr>
-          <w:ilvl w:val="0"/>
-          <w:numId w:val="1"/>
-        </w:numPr>
-      </w:pPr>
-      <w:r>
-        <w:t>NFR-2 (Performance and scale): The system shall remain responsive as the number of notifications grows large. On the backend this is achieved with indexed queries (including a full-text index), keyset pagination rather than large offsets, in-memory caching of administrative configuration and per-user preferences, batched ingestion, a shared publish/subscribe fan-out for real-time delivery, and time-partitioning with retention. On the frontend, with list virtualization, incremental loading, coalesced real-time updates, lean list rows with detail fetched on demand, and server-side grouping and filtering. The directional goal is a feed that stays smooth at 100,000+ notifications; quantitative service-level targets are deferred until they can be measured.</w:t>
-      </w:r>
-    </w:p>
-    <w:p>
-      <w:pPr>
-        <w:numPr>
-          <w:ilvl w:val="0"/>
-          <w:numId w:val="1"/>
-        </w:numPr>
-      </w:pPr>
-      <w:r>
-        <w:t>NFR-3 (Security – input validation): All input to the system — API requests and incoming notifications — shall be validated at the boundary before use, and all database access shall use parameterized queries.</w:t>
-      </w:r>
-    </w:p>
-    <w:p>
-      <w:pPr>
-        <w:numPr>
-          <w:ilvl w:val="0"/>
-          <w:numId w:val="1"/>
-        </w:numPr>
-      </w:pPr>
-      <w:r>
-        <w:t>NFR-4 (Security – authorization, phased): Administrative surfaces shall require the administrator role, and each user's data shall be scoped to the server-side authenticated identity rather than any client-supplied identifier. This is scaffolded in the first milestone — where the Admin panel is a proof-of-concept — and fully enforced in the second.</w:t>
-      </w:r>
-    </w:p>
-    <w:p>
-      <w:pPr>
-        <w:numPr>
-          <w:ilvl w:val="0"/>
-          <w:numId w:val="1"/>
-        </w:numPr>
-      </w:pPr>
-      <w:r>
-        <w:t>NFR-5 (Safety – rate limiting): The system shall limit how many notifications a single recipient can receive from a given module or category within a time window; the limits are configurable and may be overridden per module by an administrator.</w:t>
-      </w:r>
-    </w:p>
-    <w:p>
-      <w:pPr>
-        <w:numPr>
-          <w:ilvl w:val="0"/>
-          <w:numId w:val="1"/>
-        </w:numPr>
-      </w:pPr>
-      <w:r>
-        <w:t>NFR-6 (Usability): The interface shall follow the project's design system and provide clear loading, empty, and error states; low-cost accessibility basics are followed, with full WCAG 2.1 AA conformance a nice-to-have.</w:t>
-      </w:r>
-    </w:p>
-    <w:p>
-      <w:pPr>
-        <w:numPr>
-          <w:ilvl w:val="0"/>
-          <w:numId w:val="1"/>
-        </w:numPr>
-      </w:pPr>
-      <w:r>
-        <w:t>NFR-7 (Genericness and extensibility): The backend shall contain no module-specific logic; new source modules and new delivery channels shall be addable without changes to the core, with all domain-specific data confined to an opaque metadata field. The frontend shall be schema/configuration-driven so that notifications of a new kind render without frontend code changes.</w:t>
+        <w:t>Non-functional requirements describe how the system should behave. They state the requirement; the means of meeting them are covered in Sections 2.4 and 2.5.</w:t>
+      </w:r>
+    </w:p>
+    <w:p>
+      <w:pPr>
+        <w:numPr>
+          <w:ilvl w:val="0"/>
+          <w:numId w:val="1"/>
+        </w:numPr>
+      </w:pPr>
+      <w:r>
+        <w:t>NFR-1 (Reliability): No accepted notification shall be lost, including across restarts; the same notification shall never be presented to a user more than once; and a notification that repeatedly fails processing shall be set aside for inspection rather than dropped or retried forever.</w:t>
+      </w:r>
+    </w:p>
+    <w:p>
+      <w:pPr>
+        <w:numPr>
+          <w:ilvl w:val="0"/>
+          <w:numId w:val="1"/>
+        </w:numPr>
+      </w:pPr>
+      <w:r>
+        <w:t>NFR-2 (Performance): The feed shall remain responsive — browsing, filtering, and real-time updates — when a user has a very large number of notifications. The directional goal is to stay smooth at 100,000+ notifications; firm targets are set once they can be measured.</w:t>
+      </w:r>
+    </w:p>
+    <w:p>
+      <w:pPr>
+        <w:numPr>
+          <w:ilvl w:val="0"/>
+          <w:numId w:val="1"/>
+        </w:numPr>
+      </w:pPr>
+      <w:r>
+        <w:t>NFR-3 (Security — input validation): The system shall reject malformed or unexpected input without failing, and shall not be vulnerable to injection through any input it accepts.</w:t>
+      </w:r>
+    </w:p>
+    <w:p>
+      <w:pPr>
+        <w:numPr>
+          <w:ilvl w:val="0"/>
+          <w:numId w:val="1"/>
+        </w:numPr>
+      </w:pPr>
+      <w:r>
+        <w:t>NFR-4 (Security — authorization): Administrative functions shall be available only to administrators; each user shall access only their own notification state and preferences; and team- and role-targeted notifications shall reach only their intended recipients.</w:t>
+      </w:r>
+    </w:p>
+    <w:p>
+      <w:pPr>
+        <w:numPr>
+          <w:ilvl w:val="0"/>
+          <w:numId w:val="1"/>
+        </w:numPr>
+      </w:pPr>
+      <w:r>
+        <w:t>NFR-5 (Safety — rate limiting): No single recipient shall be flooded; the system shall limit how many notifications a recipient receives from a given source and category within a time window, and the limits shall be configurable.</w:t>
+      </w:r>
+    </w:p>
+    <w:p>
+      <w:pPr>
+        <w:numPr>
+          <w:ilvl w:val="0"/>
+          <w:numId w:val="1"/>
+        </w:numPr>
+      </w:pPr>
+      <w:r>
+        <w:t>NFR-6 (Usability): The interface shall follow the project's design system and present clear loading, empty, and error states.</w:t>
+      </w:r>
+    </w:p>
+    <w:p>
+      <w:pPr>
+        <w:numPr>
+          <w:ilvl w:val="0"/>
+          <w:numId w:val="1"/>
+        </w:numPr>
+      </w:pPr>
+      <w:r>
+        <w:t>NFR-7 (Extensibility): Adding a new source module or a new delivery channel shall require no change to the system's core logic.</w:t>
       </w:r>
     </w:p>
     <w:p>
@@ -1752,18 +2191,29 @@
     <w:p>
       <w:pPr/>
       <w:r>
-        <w:t>The system provides these user-facing surfaces within the enterprise application's frontend. As much of each surface as practical is rendered through shared, JSON/configuration-driven renderers and follows the project's design system.</w:t>
-      </w:r>
-    </w:p>
-    <w:p>
-      <w:pPr>
-        <w:numPr>
-          <w:ilvl w:val="0"/>
-          <w:numId w:val="1"/>
-        </w:numPr>
-      </w:pPr>
-      <w:r>
-        <w:t>Notifications feed — shows a user's notifications, categorized and ordered by priority and grouped, with server-side filtering and search, inline actions, snoozing, navigation to the originating module, on-demand summarization, and an AI chatbot panel. It loads incrementally and renders with virtualization to stay responsive at high volume. Notification cards are configuration-driven, so notifications from a new or unknown module render without frontend code.</w:t>
+        <w:t>The system presents these user-facing surfaces, rendered through shared, JSON/configuration-driven renderers where practical and following the design system:</w:t>
+      </w:r>
+    </w:p>
+    <w:p>
+      <w:pPr>
+        <w:numPr>
+          <w:ilvl w:val="0"/>
+          <w:numId w:val="1"/>
+        </w:numPr>
+      </w:pPr>
+      <w:r>
+        <w:t>Login — a simple sign-in screen for the prototype's built-in authentication.</w:t>
+      </w:r>
+    </w:p>
+    <w:p>
+      <w:pPr>
+        <w:numPr>
+          <w:ilvl w:val="0"/>
+          <w:numId w:val="1"/>
+        </w:numPr>
+      </w:pPr>
+      <w:r>
+        <w:t>Notifications feed — categorized, priority-ordered, grouped cards; filtering and search; inline actions; snoozing; navigation to the source; on-demand summarization; and an AI chatbot panel. It loads incrementally for high volume, and cards are configuration-driven so notifications from a new module render without frontend code.</w:t>
       </w:r>
     </w:p>
     <w:p>
@@ -1785,7 +2235,7 @@
         </w:numPr>
       </w:pPr>
       <w:r>
-        <w:t>Admin panel (second milestone) — per-module governance, feature kill-switches, AI configuration and resource/observability views, broadcasts, dead-letter management, an audit-log viewer, configuration export/import, and global controls; rendered from JSON schemas and configuration; requires administrator authentication.</w:t>
+        <w:t>Admin panel — from the second milestone as a basic panel (module enable/disable, feature switches), expanding over later milestones (AI configuration, per-module governance, broadcasts, observability, audit log, configuration export/import, global controls). Requires an administrator.</w:t>
       </w:r>
     </w:p>
     <w:p>
@@ -1810,62 +2260,62 @@
         </w:numPr>
       </w:pPr>
       <w:r>
-        <w:t>Notification contract (intake) — the shape a module sends: a base structure of id (the idempotency key), title, description, actions (each a label and a module callback), priority, snoozable, module, and optional category, timestamp, audience, and metadata. The audience denotes scope — global for now, with team and user reserved; team targeting will carry a specific team identifier in future. The contract is validated by a shared schema, and new needs are met by extending the opaque metadata rather than changing the contract.</w:t>
-      </w:r>
-    </w:p>
-    <w:p>
-      <w:pPr>
-        <w:numPr>
-          <w:ilvl w:val="0"/>
-          <w:numId w:val="1"/>
-        </w:numPr>
-      </w:pPr>
-      <w:r>
-        <w:t>Intake transport — abstracted. In the first milestone a simple internal/HTTP publish path lets the frontend be built and demonstrated; in the second milestone Redis Streams (with consumer groups, acknowledgement only after durable processing, a dead-letter path, and idempotency) is introduced behind the same boundary, without rewriting the pipeline.</w:t>
-      </w:r>
-    </w:p>
-    <w:p>
-      <w:pPr>
-        <w:numPr>
-          <w:ilvl w:val="0"/>
-          <w:numId w:val="1"/>
-        </w:numPr>
-      </w:pPr>
-      <w:r>
-        <w:t>Delivery channels — behind a common send(notification) adapter; in-app delivery over Server-Sent Events now, with other channels addable later without touching ingestion, policy, or the AI features.</w:t>
-      </w:r>
-    </w:p>
-    <w:p>
-      <w:pPr>
-        <w:numPr>
-          <w:ilvl w:val="0"/>
-          <w:numId w:val="1"/>
-        </w:numPr>
-      </w:pPr>
-      <w:r>
-        <w:t>AI — a locally-hosted Ollama model for generation and PostgreSQL Full-Text Search for retrieval; no external LLM service is called.</w:t>
-      </w:r>
-    </w:p>
-    <w:p>
-      <w:pPr>
-        <w:numPr>
-          <w:ilvl w:val="0"/>
-          <w:numId w:val="1"/>
-        </w:numPr>
-      </w:pPr>
-      <w:r>
-        <w:t>Action callbacks — HTTP callbacks to the originating module, which owns their authorization; the system only invokes the callback the module supplied.</w:t>
-      </w:r>
-    </w:p>
-    <w:p>
-      <w:pPr>
-        <w:numPr>
-          <w:ilvl w:val="0"/>
-          <w:numId w:val="1"/>
-        </w:numPr>
-      </w:pPr>
-      <w:r>
-        <w:t>Identity — the host application supplies the authenticated user identity; the detailed authentication model (administrator authentication and role, the feed session, and the identity used to scope per-user data) is scaffolded in the first milestone and completed in the second.</w:t>
+        <w:t>Notification contract (intake) — the shape a module sends: id (the idempotency key), title, description, actions (each a label and a module callback), priority, snoozable, module, audience, and optional category, timestamp, and metadata. The audience is { scope: 'global' | 'team' | 'role' | 'user', id? } — global targets everyone, while team, role, and user target the identified team, role, or individual. Domain-specific data rides in the opaque metadata, and new needs are met by extending it rather than changing the contract. The contract is validated by a shared schema.</w:t>
+      </w:r>
+    </w:p>
+    <w:p>
+      <w:pPr>
+        <w:numPr>
+          <w:ilvl w:val="0"/>
+          <w:numId w:val="1"/>
+        </w:numPr>
+      </w:pPr>
+      <w:r>
+        <w:t>Intake transport — abstracted. Early milestones use a simple direct/HTTP publish path (driven by the module simulators); a later milestone introduces Redis Streams (consumer groups, acknowledgement after durable processing, dead-letter) behind the same boundary.</w:t>
+      </w:r>
+    </w:p>
+    <w:p>
+      <w:pPr>
+        <w:numPr>
+          <w:ilvl w:val="0"/>
+          <w:numId w:val="1"/>
+        </w:numPr>
+      </w:pPr>
+      <w:r>
+        <w:t>AI — behind an LLM adapter (a hosted Anthropic / Claude model by default; a local Ollama model optional) and a retriever interface (PostgreSQL Full-Text Search now; vector embeddings later).</w:t>
+      </w:r>
+    </w:p>
+    <w:p>
+      <w:pPr>
+        <w:numPr>
+          <w:ilvl w:val="0"/>
+          <w:numId w:val="1"/>
+        </w:numPr>
+      </w:pPr>
+      <w:r>
+        <w:t>Delivery channels — behind a common send(notification) adapter; in-app over Server-Sent Events now, with other channels addable later without touching ingestion, policy, or the AI features.</w:t>
+      </w:r>
+    </w:p>
+    <w:p>
+      <w:pPr>
+        <w:numPr>
+          <w:ilvl w:val="0"/>
+          <w:numId w:val="1"/>
+        </w:numPr>
+      </w:pPr>
+      <w:r>
+        <w:t>Action callbacks — HTTP callbacks to the originating module (its simulator in the prototype), which owns their authorization.</w:t>
+      </w:r>
+    </w:p>
+    <w:p>
+      <w:pPr>
+        <w:numPr>
+          <w:ilvl w:val="0"/>
+          <w:numId w:val="1"/>
+        </w:numPr>
+      </w:pPr>
+      <w:r>
+        <w:t>Identity — for the prototype, the system's own simple authentication provides the user, their roles, and their team memberships; in production this is supplied by the host application. Audience resolution — which users belong to a team or hold a role — uses this identity data.</w:t>
       </w:r>
     </w:p>
     <w:sectPr>

</xml_diff>